<commit_message>
Add dated Sept 2026 field update to wardrobe guide
Adds a 'Field Update — September 2026' section covering the current state of
what the wealthy/business class are wearing (quiet luxury as baseline, soft
tailoring, texture and earthy neutrals, the rising dress-code floor) and the
2026 tariff reshuffle of the dress-shoe value map (US-made insulation,
European welted brands protected, revised Carmina/Berwick/Allen Edmonds order).

Co-Authored-By: Claude Opus 4.8 <noreply@anthropic.com>
Claude-Session: https://claude.ai/code/session_01Nra15E9zpE8viEcVuq29S4
</commit_message>
<xml_diff>
--- a/wardrobe_assets/Partner-Track_Wardrobe_Guide.docx
+++ b/wardrobe_assets/Partner-Track_Wardrobe_Guide.docx
@@ -3165,6 +3165,424 @@
     </w:tbl>
     <w:p/>
     <w:p>
+      <w:r>
+        <w:br w:type="page"/>
+      </w:r>
+    </w:p>
+    <w:p>
+      <w:pPr>
+        <w:pStyle w:val="Heading1"/>
+      </w:pPr>
+      <w:r>
+        <w:rPr>
+          <w:color w:val="1F2D4E"/>
+        </w:rPr>
+        <w:t>Field Update — September 2026</w:t>
+      </w:r>
+    </w:p>
+    <w:p>
+      <w:r>
+        <w:rPr>
+          <w:b w:val="0"/>
+          <w:i/>
+          <w:color w:val="555555"/>
+        </w:rPr>
+        <w:t>A refresh on what's actually being worn by the wealthy and business class right now, and how the shoe market has moved. Everything above remains the durable core; this section is the current read as of fall 2026.</w:t>
+      </w:r>
+    </w:p>
+    <w:p>
+      <w:pPr>
+        <w:pStyle w:val="Heading2"/>
+      </w:pPr>
+      <w:r>
+        <w:rPr>
+          <w:color w:val="1F2D4E"/>
+        </w:rPr>
+        <w:t>The headline: quiet luxury is now the baseline, not a trend</w:t>
+      </w:r>
+    </w:p>
+    <w:p>
+      <w:r>
+        <w:rPr>
+          <w:b w:val="0"/>
+          <w:i w:val="0"/>
+        </w:rPr>
+        <w:t>The single most important update: “quiet luxury” stopped being a trend and hardened into the default standard for wealthy and business dressers. Industry reporting shows demand among affluent men still rising in 2026 (searches up ~150% year-to-date). Fit over flash, no logos, muted palette, fabric as the signal — more entrenched than ever. You're aimed at the right target.</w:t>
+      </w:r>
+    </w:p>
+    <w:p>
+      <w:pPr>
+        <w:pStyle w:val="Heading2"/>
+      </w:pPr>
+      <w:r>
+        <w:rPr>
+          <w:color w:val="1F2D4E"/>
+        </w:rPr>
+        <w:t>What's genuinely shifting this season</w:t>
+      </w:r>
+    </w:p>
+    <w:p>
+      <w:pPr>
+        <w:pStyle w:val="ListBullet"/>
+      </w:pPr>
+      <w:r>
+        <w:rPr>
+          <w:b/>
+        </w:rPr>
+        <w:t xml:space="preserve">The floor rose. </w:t>
+      </w:r>
+      <w:r>
+        <w:t>the senior tier has quietly dressed back up since the return-to-office wave — “the VP isn't in a quarter-zip anymore.” Nobody sent a memo. For someone up for partner, the direction of travel is slightly more polished, so being a notch sharper than your peers is now with the grain.</w:t>
+      </w:r>
+    </w:p>
+    <w:p>
+      <w:pPr>
+        <w:pStyle w:val="ListBullet"/>
+      </w:pPr>
+      <w:r>
+        <w:rPr>
+          <w:b/>
+        </w:rPr>
+        <w:t xml:space="preserve">Soft tailoring won. </w:t>
+      </w:r>
+      <w:r>
+        <w:t>the hard-shouldered “power suit” is now “for weddings and court.” What senior men actually wear: unstructured jackets, knit blazers, hopsack sport coats — soft shoulders, easy drape. Exactly the navy-hopsack direction in this guide.</w:t>
+      </w:r>
+    </w:p>
+    <w:p>
+      <w:pPr>
+        <w:pStyle w:val="ListBullet"/>
+      </w:pPr>
+      <w:r>
+        <w:rPr>
+          <w:b/>
+        </w:rPr>
+        <w:t xml:space="preserve">Texture does the work. </w:t>
+      </w:r>
+      <w:r>
+        <w:t>the defining detail of fall 2026 is tactile, tonal cloth — mohair, brushed wools, ribbed fine-gauge knits, and muted Prince-of-Wales / glen checks done low-contrast. You now signal through fabric, not through anything loud.</w:t>
+      </w:r>
+    </w:p>
+    <w:p>
+      <w:pPr>
+        <w:pStyle w:val="ListBullet"/>
+      </w:pPr>
+      <w:r>
+        <w:rPr>
+          <w:b/>
+        </w:rPr>
+        <w:t xml:space="preserve">Earthy neutrals are the palette. </w:t>
+      </w:r>
+      <w:r>
+        <w:t>camel, chocolate brown, taupe, charcoal, olive — “colors that feel expensive and go with everything” — with a single jolt of burgundy or rich red as the accent. Brown has fully shed the old “no brown in business” baggage and is arguably the status neutral right now.</w:t>
+      </w:r>
+    </w:p>
+    <w:p>
+      <w:pPr>
+        <w:pStyle w:val="ListBullet"/>
+      </w:pPr>
+      <w:r>
+        <w:rPr>
+          <w:b/>
+        </w:rPr>
+        <w:t xml:space="preserve">Quiet formality is creeping back. </w:t>
+      </w:r>
+      <w:r>
+        <w:t>double-breasted jackets, the occasional three-piece for genuinely formal occasions, and a muted pinstripe revival are appearing among the more style-forward wealthy — but tonal and soft, never flashy. Optional flourishes, not requirements.</w:t>
+      </w:r>
+    </w:p>
+    <w:p>
+      <w:pPr>
+        <w:pStyle w:val="Heading2"/>
+      </w:pPr>
+      <w:r>
+        <w:rPr>
+          <w:color w:val="1F2D4E"/>
+        </w:rPr>
+        <w:t>What this means for you (warm climate, partner-track)</w:t>
+      </w:r>
+    </w:p>
+    <w:p>
+      <w:pPr>
+        <w:pStyle w:val="ListBullet"/>
+      </w:pPr>
+      <w:r>
+        <w:rPr>
+          <w:b/>
+        </w:rPr>
+        <w:t xml:space="preserve">Lean into texture + earth tones. </w:t>
+      </w:r>
+      <w:r>
+        <w:t>a soft, textured sport coat — hopsack or a tonal glen-check — in navy, charcoal, or now brown/olive is the most current piece you can wear.</w:t>
+      </w:r>
+    </w:p>
+    <w:p>
+      <w:pPr>
+        <w:pStyle w:val="ListBullet"/>
+      </w:pPr>
+      <w:r>
+        <w:rPr>
+          <w:b/>
+        </w:rPr>
+        <w:t xml:space="preserve">Add a warm neutral. </w:t>
+      </w:r>
+      <w:r>
+        <w:t>if you buy one new thing this season, make it a camel or chocolate element (a fine-gauge knit or trousers) — the most of-the-moment quiet-luxury signal without being a gamble.</w:t>
+      </w:r>
+    </w:p>
+    <w:p>
+      <w:pPr>
+        <w:pStyle w:val="ListBullet"/>
+      </w:pPr>
+      <w:r>
+        <w:rPr>
+          <w:b/>
+        </w:rPr>
+        <w:t xml:space="preserve">Fine-gauge knits over quarter-zips. </w:t>
+      </w:r>
+      <w:r>
+        <w:t>the quarter-zip is the mass “polished casual” workhorse; for signaling seniority it reads a notch junior. A merino crewneck or knit polo under the jacket is the wealthier version.</w:t>
+      </w:r>
+    </w:p>
+    <w:p>
+      <w:r>
+        <w:rPr>
+          <w:b w:val="0"/>
+          <w:i/>
+          <w:color w:val="555555"/>
+        </w:rPr>
+        <w:t>Honest caveat: much “fall 2026 trends” content (velvet, jewel tones, bold pinstripes) is trend churn aimed at selling clothes. The durable signal is narrower on purpose — quiet luxury is the standard, soft tailoring won, texture and earth tones are the accent, the floor rose. Chasing visible trends is itself the tell you're trying to avoid.</w:t>
+      </w:r>
+    </w:p>
+    <w:p>
+      <w:pPr>
+        <w:pStyle w:val="Heading2"/>
+      </w:pPr>
+      <w:r>
+        <w:rPr>
+          <w:color w:val="1F2D4E"/>
+        </w:rPr>
+        <w:t>Shoes — the 2026 tariff reshuffle</w:t>
+      </w:r>
+    </w:p>
+    <w:p>
+      <w:r>
+        <w:rPr>
+          <w:b w:val="0"/>
+          <w:i w:val="0"/>
+        </w:rPr>
+        <w:t>Tariffs redrew the value map this year. Footwear carries some of the highest US import duties of any consumer good, and 2026 added pressure — but it landed unevenly:</w:t>
+      </w:r>
+    </w:p>
+    <w:p>
+      <w:pPr>
+        <w:pStyle w:val="ListBullet"/>
+      </w:pPr>
+      <w:r>
+        <w:rPr>
+          <w:b/>
+        </w:rPr>
+        <w:t xml:space="preserve">US-made is now tariff-insulated. </w:t>
+      </w:r>
+      <w:r>
+        <w:t>Allen Edmonds is still made in Port Washington, Wisconsin, so it carries no import duty — a real, new structural cost edge.</w:t>
+      </w:r>
+    </w:p>
+    <w:p>
+      <w:pPr>
+        <w:pStyle w:val="ListBullet"/>
+      </w:pPr>
+      <w:r>
+        <w:rPr>
+          <w:b/>
+        </w:rPr>
+        <w:t xml:space="preserve">European welted shoes largely dodged it. </w:t>
+      </w:r>
+      <w:r>
+        <w:t>Italian and Spanish leather footwear settled under the EU–US deal's ~15% all-inclusive ceiling (rather than stacking on base rates), and the UK has its own arrangement — so Carmina (Spain), Crockett &amp; Jones and Loake (England) got less expensive than feared. The value case holds.</w:t>
+      </w:r>
+    </w:p>
+    <w:p>
+      <w:pPr>
+        <w:pStyle w:val="ListBullet"/>
+      </w:pPr>
+      <w:r>
+        <w:rPr>
+          <w:b/>
+        </w:rPr>
+        <w:t xml:space="preserve">Asia-made shoes took the bigger hit. </w:t>
+      </w:r>
+      <w:r>
+        <w:t>worth knowing for newer names like Grant Stone.</w:t>
+      </w:r>
+    </w:p>
+    <w:p>
+      <w:r>
+        <w:rPr>
+          <w:b/>
+          <w:i w:val="0"/>
+          <w:color w:val="1F2D4E"/>
+        </w:rPr>
+        <w:t>Brand status changes:</w:t>
+      </w:r>
+    </w:p>
+    <w:p>
+      <w:pPr>
+        <w:pStyle w:val="ListBullet"/>
+      </w:pPr>
+      <w:r>
+        <w:rPr>
+          <w:b/>
+        </w:rPr>
+        <w:t xml:space="preserve">Allen Edmonds Park Avenue: </w:t>
+      </w:r>
+      <w:r>
+        <w:t>buy on sale ONLY, and inspect the pair. List has crept to ~$450–550, but it still drops to ~$200–250 on sale — that discounted, made-in-USA, resoleable price is the case. QC criticism has gotten louder in 2026, so check welt stitching and finishing before buying.</w:t>
+      </w:r>
+    </w:p>
+    <w:p>
+      <w:pPr>
+        <w:pStyle w:val="ListBullet"/>
+      </w:pPr>
+      <w:r>
+        <w:rPr>
+          <w:b/>
+        </w:rPr>
+        <w:t xml:space="preserve">Carmina: </w:t>
+      </w:r>
+      <w:r>
+        <w:t>still the buy-once sweet spot (~$475), and now better tariff-protected. Unchanged top pick.</w:t>
+      </w:r>
+    </w:p>
+    <w:p>
+      <w:pPr>
+        <w:pStyle w:val="ListBullet"/>
+      </w:pPr>
+      <w:r>
+        <w:rPr>
+          <w:b/>
+        </w:rPr>
+        <w:t xml:space="preserve">Meermin: </w:t>
+      </w:r>
+      <w:r>
+        <w:t>still the value floor (~$200) for a first Goodyear-welted pair.</w:t>
+      </w:r>
+    </w:p>
+    <w:p>
+      <w:pPr>
+        <w:pStyle w:val="ListBullet"/>
+      </w:pPr>
+      <w:r>
+        <w:rPr>
+          <w:b/>
+        </w:rPr>
+        <w:t xml:space="preserve">NEW — Berwick 1707: </w:t>
+      </w:r>
+      <w:r>
+        <w:t>a Spanish maker (same Almansa region as Carmina) repeatedly cited as the best quality-style-value combo of 2026, often a bit cheaper than Carmina. Worth a serious look. Also rising: Myrqvist (Portugal-made) and Velasca (Italy).</w:t>
+      </w:r>
+    </w:p>
+    <w:p>
+      <w:r>
+        <w:rPr>
+          <w:b/>
+          <w:i w:val="0"/>
+          <w:color w:val="1F2D4E"/>
+        </w:rPr>
+        <w:t>Revised smart-value order:  (1) Carmina (~$475) or Berwick 1707 — the safest value given tariffs;  (2) Allen Edmonds Park Avenue on sale (~$230) if the QC checks out;  (3) Meermin (~$200) as the value floor. Everything else in Section 3 — oxford-vs-derby, brown over black, suede for the heat, resole-don't-replace — is unchanged.</w:t>
+      </w:r>
+    </w:p>
+    <w:p>
+      <w:r>
+        <w:rPr>
+          <w:i/>
+          <w:color w:val="555555"/>
+          <w:sz w:val="18"/>
+        </w:rPr>
+        <w:t xml:space="preserve">Update sources: </w:t>
+      </w:r>
+      <w:hyperlink r:id="rId51">
+        <w:r>
+          <w:rPr>
+            <w:color w:val="0563C1"/>
+            <w:u w:val="single"/>
+            <w:sz w:val="18"/>
+          </w:rPr>
+          <w:t>WWD (quiet luxury still rising)</w:t>
+        </w:r>
+      </w:hyperlink>
+      <w:r>
+        <w:rPr>
+          <w:sz w:val="18"/>
+        </w:rPr>
+        <w:t xml:space="preserve">  ·  </w:t>
+      </w:r>
+      <w:hyperlink r:id="rId52">
+        <w:r>
+          <w:rPr>
+            <w:color w:val="0563C1"/>
+            <w:u w:val="single"/>
+            <w:sz w:val="18"/>
+          </w:rPr>
+          <w:t>W Magazine (power suits, not at the office)</w:t>
+        </w:r>
+      </w:hyperlink>
+      <w:r>
+        <w:rPr>
+          <w:sz w:val="18"/>
+        </w:rPr>
+        <w:t xml:space="preserve">  ·  </w:t>
+      </w:r>
+      <w:hyperlink r:id="rId53">
+        <w:r>
+          <w:rPr>
+            <w:color w:val="0563C1"/>
+            <w:u w:val="single"/>
+            <w:sz w:val="18"/>
+          </w:rPr>
+          <w:t>Real Men Real Style (office 2026)</w:t>
+        </w:r>
+      </w:hyperlink>
+      <w:r>
+        <w:rPr>
+          <w:sz w:val="18"/>
+        </w:rPr>
+        <w:t xml:space="preserve">  ·  </w:t>
+      </w:r>
+      <w:hyperlink r:id="rId54">
+        <w:r>
+          <w:rPr>
+            <w:color w:val="0563C1"/>
+            <w:u w:val="single"/>
+            <w:sz w:val="18"/>
+          </w:rPr>
+          <w:t>Stitchdown (footwear tariffs)</w:t>
+        </w:r>
+      </w:hyperlink>
+      <w:r>
+        <w:rPr>
+          <w:sz w:val="18"/>
+        </w:rPr>
+        <w:t xml:space="preserve">  ·  </w:t>
+      </w:r>
+      <w:hyperlink r:id="rId55">
+        <w:r>
+          <w:rPr>
+            <w:color w:val="0563C1"/>
+            <w:u w:val="single"/>
+            <w:sz w:val="18"/>
+          </w:rPr>
+          <w:t>A Fine Pair of Shoes (best value GYW 2026)</w:t>
+        </w:r>
+      </w:hyperlink>
+      <w:r>
+        <w:rPr>
+          <w:sz w:val="18"/>
+        </w:rPr>
+        <w:t xml:space="preserve">  ·  </w:t>
+      </w:r>
+    </w:p>
+    <w:p>
       <w:pPr>
         <w:pStyle w:val="Heading1"/>
       </w:pPr>

</xml_diff>

<commit_message>
Add denim, versatile-shoe & regional-shopping field update (Sept 30, 2026)
Documents the working-session findings: high-quality dark denim tiers and
brand picks with direct product links (A.P.C., 3sixteen, Citizens of Humanity,
AG, Frame), raw-denim sizing/hemming guidance, the three most versatile shoe
styles, and an East Tennessee in-person shopping map (Dillard's/Yacoubian in
Chattanooga, M.S. McClellan in Knoxville, Nordstrom in Nashville) plus brands
to skip.

Co-Authored-By: Claude Opus 4.8 <noreply@anthropic.com>
Claude-Session: https://claude.ai/code/session_01Nra15E9zpE8viEcVuq29S4
</commit_message>
<xml_diff>
--- a/wardrobe_assets/Partner-Track_Wardrobe_Guide.docx
+++ b/wardrobe_assets/Partner-Track_Wardrobe_Guide.docx
@@ -3583,6 +3583,670 @@
       </w:r>
     </w:p>
     <w:p>
+      <w:r>
+        <w:br w:type="page"/>
+      </w:r>
+    </w:p>
+    <w:p>
+      <w:pPr>
+        <w:pStyle w:val="Heading1"/>
+      </w:pPr>
+      <w:r>
+        <w:rPr>
+          <w:color w:val="1F2D4E"/>
+        </w:rPr>
+        <w:t>Field Update — Denim, Versatile Shoes &amp; Regional Shopping (Sept 30, 2026)</w:t>
+      </w:r>
+    </w:p>
+    <w:p>
+      <w:r>
+        <w:rPr>
+          <w:b w:val="0"/>
+          <w:i/>
+          <w:color w:val="555555"/>
+        </w:rPr>
+        <w:t>Captured from a working session on high-quality dark denim, the most versatile shoes to own, and where to actually buy this tier in the East Tennessee region.</w:t>
+      </w:r>
+    </w:p>
+    <w:p>
+      <w:pPr>
+        <w:pStyle w:val="Heading2"/>
+      </w:pPr>
+      <w:r>
+        <w:rPr>
+          <w:color w:val="1F2D4E"/>
+        </w:rPr>
+        <w:t>High-quality dark denim — what the wealthy actually wear</w:t>
+      </w:r>
+    </w:p>
+    <w:p>
+      <w:r>
+        <w:rPr>
+          <w:b w:val="0"/>
+          <w:i w:val="0"/>
+        </w:rPr>
+        <w:t>Dark denim is the only denim that belongs in a quiet-status wardrobe. The signal is in the execution, not the label: deep color, clean finish, no logos, no distressing. The tiers:</w:t>
+      </w:r>
+    </w:p>
+    <w:p>
+      <w:pPr>
+        <w:pStyle w:val="ListBullet"/>
+      </w:pPr>
+      <w:r>
+        <w:rPr>
+          <w:b/>
+        </w:rPr>
+        <w:t xml:space="preserve">Quiet-luxury (money-no-object): </w:t>
+      </w:r>
+      <w:r>
+        <w:t>Loro Piana, Brunello Cucinelli, Zegna, The Row — soft, dark, logo-free, ~$500–800. Literal quiet-wealth denim.</w:t>
+      </w:r>
+    </w:p>
+    <w:p>
+      <w:pPr>
+        <w:pStyle w:val="ListBullet"/>
+      </w:pPr>
+      <w:r>
+        <w:rPr>
+          <w:b/>
+        </w:rPr>
+        <w:t xml:space="preserve">Connoisseur raw selvedge (the smart pick): </w:t>
+      </w:r>
+      <w:r>
+        <w:t>A.P.C. (the Petit New Standard is the reference), 3sixteen, and Japanese selvedge houses (Momotaro, Iron Heart, Pure Blue Japan, Warehouse &amp; Co). Reads as taste/knowledge, not spend. ~$200–400.</w:t>
+      </w:r>
+    </w:p>
+    <w:p>
+      <w:pPr>
+        <w:pStyle w:val="ListBullet"/>
+      </w:pPr>
+      <w:r>
+        <w:rPr>
+          <w:b/>
+        </w:rPr>
+        <w:t xml:space="preserve">Comfort premium (no break-in): </w:t>
+      </w:r>
+      <w:r>
+        <w:t>Citizens of Humanity, AG (Tellis), Frame (L'Homme), Rag &amp; Bone, Paige, DL1961 — soft, stretchy, dark, no break-in. The affluent-professional default. ~$200–270.</w:t>
+      </w:r>
+    </w:p>
+    <w:p>
+      <w:r>
+        <w:rPr>
+          <w:b/>
+          <w:i w:val="0"/>
+          <w:color w:val="9C2B2B"/>
+        </w:rPr>
+        <w:t>Hard avoid (new-money tells): True Religion, Robin's Jean, Affliction, Ed Hardy, flashy Diesel — big contrast stitching, logo pockets, rhinestones, heavy whiskering.</w:t>
+      </w:r>
+    </w:p>
+    <w:p>
+      <w:pPr>
+        <w:pStyle w:val="Heading2"/>
+      </w:pPr>
+      <w:r>
+        <w:rPr>
+          <w:color w:val="1F2D4E"/>
+        </w:rPr>
+        <w:t>The detail rules that actually matter</w:t>
+      </w:r>
+    </w:p>
+    <w:p>
+      <w:pPr>
+        <w:pStyle w:val="ListBullet"/>
+      </w:pPr>
+      <w:r>
+        <w:rPr>
+          <w:b/>
+        </w:rPr>
+        <w:t xml:space="preserve">Color: </w:t>
+      </w:r>
+      <w:r>
+        <w:t>deep indigo, a dark rinse/one-wash (near blue-black), or raw (darkest; fades to you). No light or faded washes.</w:t>
+      </w:r>
+    </w:p>
+    <w:p>
+      <w:pPr>
+        <w:pStyle w:val="ListBullet"/>
+      </w:pPr>
+      <w:r>
+        <w:rPr>
+          <w:b/>
+        </w:rPr>
+        <w:t xml:space="preserve">Finish: </w:t>
+      </w:r>
+      <w:r>
+        <w:t>no rips, no fading, no whiskering. Clean and dark, always.</w:t>
+      </w:r>
+    </w:p>
+    <w:p>
+      <w:pPr>
+        <w:pStyle w:val="ListBullet"/>
+      </w:pPr>
+      <w:r>
+        <w:rPr>
+          <w:b/>
+        </w:rPr>
+        <w:t xml:space="preserve">Back pockets: </w:t>
+      </w:r>
+      <w:r>
+        <w:t>minimal/no contrast stitching, no logo patch, no loud arcuate design. A small leather patch is fine.</w:t>
+      </w:r>
+    </w:p>
+    <w:p>
+      <w:pPr>
+        <w:pStyle w:val="ListBullet"/>
+      </w:pPr>
+      <w:r>
+        <w:rPr>
+          <w:b/>
+        </w:rPr>
+        <w:t xml:space="preserve">Fit: </w:t>
+      </w:r>
+      <w:r>
+        <w:t>slim-straight or straight, trouser-like, clean break at the shoe. Not skinny, not baggy. “Selvedge” (the self-edge seen when cuffed) is a subtle knowledge signal.</w:t>
+      </w:r>
+    </w:p>
+    <w:p>
+      <w:pPr>
+        <w:pStyle w:val="Heading2"/>
+      </w:pPr>
+      <w:r>
+        <w:rPr>
+          <w:color w:val="1F2D4E"/>
+        </w:rPr>
+        <w:t>Recommended dark-denim picks (direct links)</w:t>
+      </w:r>
+    </w:p>
+    <w:p>
+      <w:pPr>
+        <w:pStyle w:val="ListBullet"/>
+      </w:pPr>
+      <w:r>
+        <w:rPr>
+          <w:b/>
+        </w:rPr>
+        <w:t xml:space="preserve">A.P.C. Petit New Standard — raw indigo, ~$250 (top quiet-status pick): </w:t>
+      </w:r>
+      <w:hyperlink r:id="rId56">
+        <w:r>
+          <w:rPr>
+            <w:color w:val="0563C1"/>
+            <w:u w:val="single"/>
+            <w:sz w:val="18"/>
+          </w:rPr>
+          <w:t>product page</w:t>
+        </w:r>
+      </w:hyperlink>
+    </w:p>
+    <w:p>
+      <w:pPr>
+        <w:pStyle w:val="ListBullet"/>
+      </w:pPr>
+      <w:r>
+        <w:rPr>
+          <w:b/>
+        </w:rPr>
+        <w:t xml:space="preserve">3sixteen — raw selvedge, US-made, ~$220–230: </w:t>
+      </w:r>
+      <w:hyperlink r:id="rId57">
+        <w:r>
+          <w:rPr>
+            <w:color w:val="0563C1"/>
+            <w:u w:val="single"/>
+            <w:sz w:val="18"/>
+          </w:rPr>
+          <w:t>CS-100x Classic Straight</w:t>
+        </w:r>
+      </w:hyperlink>
+      <w:r>
+        <w:t xml:space="preserve">  ·  </w:t>
+      </w:r>
+      <w:hyperlink r:id="rId58">
+        <w:r>
+          <w:rPr>
+            <w:color w:val="0563C1"/>
+            <w:u w:val="single"/>
+            <w:sz w:val="18"/>
+          </w:rPr>
+          <w:t>ST-120x Slim Tapered</w:t>
+        </w:r>
+      </w:hyperlink>
+      <w:r>
+        <w:t xml:space="preserve">  ·  </w:t>
+      </w:r>
+      <w:hyperlink r:id="rId59">
+        <w:r>
+          <w:rPr>
+            <w:color w:val="0563C1"/>
+            <w:u w:val="single"/>
+            <w:sz w:val="18"/>
+          </w:rPr>
+          <w:t>CS-220x Double Black</w:t>
+        </w:r>
+      </w:hyperlink>
+    </w:p>
+    <w:p>
+      <w:pPr>
+        <w:pStyle w:val="ListBullet"/>
+      </w:pPr>
+      <w:r>
+        <w:rPr>
+          <w:b/>
+        </w:rPr>
+        <w:t xml:space="preserve">Citizens of Humanity Gage Slim Straight — Falcon (cleanest dark), ~$268: </w:t>
+      </w:r>
+      <w:hyperlink r:id="rId60">
+        <w:r>
+          <w:rPr>
+            <w:color w:val="0563C1"/>
+            <w:u w:val="single"/>
+            <w:sz w:val="18"/>
+          </w:rPr>
+          <w:t>product page</w:t>
+        </w:r>
+      </w:hyperlink>
+    </w:p>
+    <w:p>
+      <w:pPr>
+        <w:pStyle w:val="ListBullet"/>
+      </w:pPr>
+      <w:r>
+        <w:rPr>
+          <w:b/>
+        </w:rPr>
+        <w:t xml:space="preserve">AG Tellis Modern Slim — Stellar (near-black, clean), ~$205: </w:t>
+      </w:r>
+      <w:hyperlink r:id="rId61">
+        <w:r>
+          <w:rPr>
+            <w:color w:val="0563C1"/>
+            <w:u w:val="single"/>
+            <w:sz w:val="18"/>
+          </w:rPr>
+          <w:t>product page</w:t>
+        </w:r>
+      </w:hyperlink>
+    </w:p>
+    <w:p>
+      <w:pPr>
+        <w:pStyle w:val="ListBullet"/>
+      </w:pPr>
+      <w:r>
+        <w:rPr>
+          <w:b/>
+        </w:rPr>
+        <w:t xml:space="preserve">Frame L'Homme Slim — Placid (dark blue), ~$228: </w:t>
+      </w:r>
+      <w:hyperlink r:id="rId62">
+        <w:r>
+          <w:rPr>
+            <w:color w:val="0563C1"/>
+            <w:u w:val="single"/>
+            <w:sz w:val="18"/>
+          </w:rPr>
+          <w:t>product page</w:t>
+        </w:r>
+      </w:hyperlink>
+    </w:p>
+    <w:p>
+      <w:r>
+        <w:rPr>
+          <w:b w:val="0"/>
+          <w:i/>
+          <w:color w:val="555555"/>
+        </w:rPr>
+        <w:t>Best per style:  cleanest dark + zero break-in → Citizens Gage in Falcon;  near-black clean → AG Tellis Stellar;  buy-once, fades-to-you → 3sixteen CS-100x or A.P.C. Petit New Standard.</w:t>
+      </w:r>
+    </w:p>
+    <w:p>
+      <w:pPr>
+        <w:pStyle w:val="Heading2"/>
+      </w:pPr>
+      <w:r>
+        <w:rPr>
+          <w:color w:val="1F2D4E"/>
+        </w:rPr>
+        <w:t>Fit, sizing &amp; hemming (raw denim)</w:t>
+      </w:r>
+    </w:p>
+    <w:p>
+      <w:pPr>
+        <w:pStyle w:val="ListBullet"/>
+      </w:pPr>
+      <w:r>
+        <w:rPr>
+          <w:b/>
+        </w:rPr>
+        <w:t xml:space="preserve">Waist is what matters. </w:t>
+      </w:r>
+      <w:r>
+        <w:t>get the WAIST right; length you can always fix. Raw denim stretches ~1" in the waist, so size DOWN one from your usual.</w:t>
+      </w:r>
+    </w:p>
+    <w:p>
+      <w:pPr>
+        <w:pStyle w:val="ListBullet"/>
+      </w:pPr>
+      <w:r>
+        <w:rPr>
+          <w:b/>
+        </w:rPr>
+        <w:t xml:space="preserve">Length: </w:t>
+      </w:r>
+      <w:r>
+        <w:t>the least critical measurement — you hem it. Between 30 and 32? Buy the 32 and shorten it; easier to remove length than wish you had more.</w:t>
+      </w:r>
+    </w:p>
+    <w:p>
+      <w:pPr>
+        <w:pStyle w:val="ListBullet"/>
+      </w:pPr>
+      <w:r>
+        <w:rPr>
+          <w:b/>
+        </w:rPr>
+        <w:t xml:space="preserve">Break: </w:t>
+      </w:r>
+      <w:r>
+        <w:t>aim for no break or a slight/quarter break — hem just kissing the shoe. Bring the loafers you'll wear to the tailor.</w:t>
+      </w:r>
+    </w:p>
+    <w:p>
+      <w:pPr>
+        <w:pStyle w:val="ListBullet"/>
+      </w:pPr>
+      <w:r>
+        <w:rPr>
+          <w:b/>
+        </w:rPr>
+        <w:t xml:space="preserve">Selvedge hemming: </w:t>
+      </w:r>
+      <w:r>
+        <w:t>ask for a chain-stitch hem and to reuse the original hem — it preserves the selvedge “roping” fade. Or cuff once to show the selvedge edge. Don't wash raw denim for the first couple months; hem to the final length after any shrink.</w:t>
+      </w:r>
+    </w:p>
+    <w:p>
+      <w:pPr>
+        <w:pStyle w:val="Heading2"/>
+      </w:pPr>
+      <w:r>
+        <w:rPr>
+          <w:color w:val="1F2D4E"/>
+        </w:rPr>
+        <w:t>The most versatile shoes to own (all-rounders)</w:t>
+      </w:r>
+    </w:p>
+    <w:p>
+      <w:r>
+        <w:rPr>
+          <w:b w:val="0"/>
+          <w:i w:val="0"/>
+        </w:rPr>
+        <w:t>Three styles cover almost everything — suit, business casual, jeans, dinner, warm climate:</w:t>
+      </w:r>
+    </w:p>
+    <w:p>
+      <w:pPr>
+        <w:pStyle w:val="ListBullet"/>
+      </w:pPr>
+      <w:r>
+        <w:rPr>
+          <w:b/>
+        </w:rPr>
+        <w:t xml:space="preserve">1. Dark-brown / burgundy penny loafer — </w:t>
+      </w:r>
+      <w:r>
+        <w:t>the single most versatile shoe (suit → chinos → dark jeans → dinner). Burgundy/oxblood quietly out-classes plain brown.</w:t>
+      </w:r>
+    </w:p>
+    <w:p>
+      <w:pPr>
+        <w:pStyle w:val="ListBullet"/>
+      </w:pPr>
+      <w:r>
+        <w:rPr>
+          <w:b/>
+        </w:rPr>
+        <w:t xml:space="preserve">2. Dark-brown cap-toe oxford — </w:t>
+      </w:r>
+      <w:r>
+        <w:t>the dress anchor for suited/formal days. Dark brown does more than black in a warm climate.</w:t>
+      </w:r>
+    </w:p>
+    <w:p>
+      <w:pPr>
+        <w:pStyle w:val="ListBullet"/>
+      </w:pPr>
+      <w:r>
+        <w:rPr>
+          <w:b/>
+        </w:rPr>
+        <w:t xml:space="preserve">3. Suede loafer — </w:t>
+      </w:r>
+      <w:r>
+        <w:t>the warm-climate smart-casual workhorse (chinos or dark jeans + blazer).</w:t>
+      </w:r>
+    </w:p>
+    <w:p>
+      <w:r>
+        <w:rPr>
+          <w:b w:val="0"/>
+          <w:i/>
+          <w:color w:val="555555"/>
+        </w:rPr>
+        <w:t>Value picks: Carmina (~$475) or Berwick 1707 (2026 value riser) — both Spanish, Goodyear-welted; Allen Edmonds Park Avenue on sale (~$230, made in USA); Meermin (~$200 floor). If you buy two, the penny + cap-toe oxford cover ~90% of your life.</w:t>
+      </w:r>
+    </w:p>
+    <w:p>
+      <w:pPr>
+        <w:pStyle w:val="Heading2"/>
+      </w:pPr>
+      <w:r>
+        <w:rPr>
+          <w:color w:val="1F2D4E"/>
+        </w:rPr>
+        <w:t>Where to buy this tier in person — East Tennessee</w:t>
+      </w:r>
+    </w:p>
+    <w:p>
+      <w:pPr>
+        <w:pStyle w:val="ListBullet"/>
+      </w:pPr>
+      <w:r>
+        <w:rPr>
+          <w:b/>
+        </w:rPr>
+        <w:t xml:space="preserve">Cleveland, TN: </w:t>
+      </w:r>
+      <w:r>
+        <w:t>no dedicated high-end welted-shoe retailer. (Hardwick Clothes, the historic American suitmaker, is based here — but that's suits.) The value brands (Carmina, Berwick, Meermin, A.P.C., 3sixteen) are online-only in the US regardless.</w:t>
+      </w:r>
+    </w:p>
+    <w:p>
+      <w:pPr>
+        <w:pStyle w:val="ListBullet"/>
+      </w:pPr>
+      <w:r>
+        <w:rPr>
+          <w:b/>
+        </w:rPr>
+        <w:t xml:space="preserve">Chattanooga (~30 min): </w:t>
+      </w:r>
+      <w:r>
+        <w:t>Dillard's at Hamilton Place carries Allen Edmonds (Park Avenue), Cole Haan, Johnston &amp; Murphy — best bet for a same-day, Goodyear-welted shoe in your size. Yacoubian Tailors (629 Broad St) is an upscale clothier that also carries Allen Edmonds (call ahead; thin shoe stock). Bruce Baird &amp; Co. was the Alden dealer but the downtown store closed/relocated in 2025 — call before relying on it.</w:t>
+      </w:r>
+    </w:p>
+    <w:p>
+      <w:pPr>
+        <w:pStyle w:val="ListBullet"/>
+      </w:pPr>
+      <w:r>
+        <w:rPr>
+          <w:b/>
+        </w:rPr>
+        <w:t xml:space="preserve">Knoxville (~1.25–1.5 hr): </w:t>
+      </w:r>
+      <w:r>
+        <w:t>M.S. McClellan &amp; Co. (5614 Kingston Pike) — an authorized Alden dealer and the best in-person high-end option in the region. Call ahead to confirm Alden stock in your size.</w:t>
+      </w:r>
+    </w:p>
+    <w:p>
+      <w:pPr>
+        <w:pStyle w:val="ListBullet"/>
+      </w:pPr>
+      <w:r>
+        <w:rPr>
+          <w:b/>
+        </w:rPr>
+        <w:t xml:space="preserve">Nashville (~2.5 hr): </w:t>
+      </w:r>
+      <w:r>
+        <w:t>Nordstrom at The Mall at Green Hills — the region's best Allen Edmonds selection plus premium denim (AG, Citizens, Frame). J.Crew carries a limited Alden selection.</w:t>
+      </w:r>
+    </w:p>
+    <w:p>
+      <w:pPr>
+        <w:pStyle w:val="Heading2"/>
+      </w:pPr>
+      <w:r>
+        <w:rPr>
+          <w:color w:val="1F2D4E"/>
+        </w:rPr>
+        <w:t>Brands to skip (seen while shopping)</w:t>
+      </w:r>
+    </w:p>
+    <w:p>
+      <w:pPr>
+        <w:pStyle w:val="ListBullet"/>
+      </w:pPr>
+      <w:r>
+        <w:rPr>
+          <w:b/>
+        </w:rPr>
+        <w:t xml:space="preserve">Steve Madden: </w:t>
+      </w:r>
+      <w:r>
+        <w:t>fast-fashion, glued soles, flashy metal-bit hardware — the try-hard tell.</w:t>
+      </w:r>
+    </w:p>
+    <w:p>
+      <w:pPr>
+        <w:pStyle w:val="ListBullet"/>
+      </w:pPr>
+      <w:r>
+        <w:rPr>
+          <w:b/>
+        </w:rPr>
+        <w:t xml:space="preserve">Sperry / L.L.Bean: </w:t>
+      </w:r>
+      <w:r>
+        <w:t>fine brands, wrong category — casual/weekend only (boat shoes, duck boots).</w:t>
+      </w:r>
+    </w:p>
+    <w:p>
+      <w:pPr>
+        <w:pStyle w:val="ListBullet"/>
+      </w:pPr>
+      <w:r>
+        <w:rPr>
+          <w:b/>
+        </w:rPr>
+        <w:t xml:space="preserve">Cole Haan: </w:t>
+      </w:r>
+      <w:r>
+        <w:t>acceptable stopgap for business casual, but cemented (not resoleable) — not a buy-for-life shoe.</w:t>
+      </w:r>
+    </w:p>
+    <w:p>
+      <w:pPr>
+        <w:pStyle w:val="ListBullet"/>
+      </w:pPr>
+      <w:r>
+        <w:rPr>
+          <w:b/>
+        </w:rPr>
+        <w:t xml:space="preserve">Josef Seibel / Pikolinos: </w:t>
+      </w:r>
+      <w:r>
+        <w:t>comfort brands — casual styling, not a status/dress shoe.</w:t>
+      </w:r>
+    </w:p>
+    <w:p>
+      <w:r>
+        <w:rPr>
+          <w:i/>
+          <w:color w:val="555555"/>
+          <w:sz w:val="18"/>
+        </w:rPr>
+        <w:t xml:space="preserve">Update sources: </w:t>
+      </w:r>
+      <w:hyperlink r:id="rId56">
+        <w:r>
+          <w:rPr>
+            <w:color w:val="0563C1"/>
+            <w:u w:val="single"/>
+            <w:sz w:val="18"/>
+          </w:rPr>
+          <w:t>A.P.C. (official store)</w:t>
+        </w:r>
+      </w:hyperlink>
+      <w:r>
+        <w:rPr>
+          <w:sz w:val="18"/>
+        </w:rPr>
+        <w:t xml:space="preserve">  ·  </w:t>
+      </w:r>
+      <w:hyperlink r:id="rId63">
+        <w:r>
+          <w:rPr>
+            <w:color w:val="0563C1"/>
+            <w:u w:val="single"/>
+            <w:sz w:val="18"/>
+          </w:rPr>
+          <w:t>3sixteen denim</w:t>
+        </w:r>
+      </w:hyperlink>
+      <w:r>
+        <w:rPr>
+          <w:sz w:val="18"/>
+        </w:rPr>
+        <w:t xml:space="preserve">  ·  </w:t>
+      </w:r>
+      <w:hyperlink r:id="rId64">
+        <w:r>
+          <w:rPr>
+            <w:color w:val="0563C1"/>
+            <w:u w:val="single"/>
+            <w:sz w:val="18"/>
+          </w:rPr>
+          <w:t>Dillard's Hamilton Place</w:t>
+        </w:r>
+      </w:hyperlink>
+      <w:r>
+        <w:rPr>
+          <w:sz w:val="18"/>
+        </w:rPr>
+        <w:t xml:space="preserve">  ·  </w:t>
+      </w:r>
+      <w:hyperlink r:id="rId65">
+        <w:r>
+          <w:rPr>
+            <w:color w:val="0563C1"/>
+            <w:u w:val="single"/>
+            <w:sz w:val="18"/>
+          </w:rPr>
+          <w:t>Chattanoogan — Bruce Baird closure</w:t>
+        </w:r>
+      </w:hyperlink>
+      <w:r>
+        <w:rPr>
+          <w:sz w:val="18"/>
+        </w:rPr>
+        <w:t xml:space="preserve">  ·  </w:t>
+      </w:r>
+    </w:p>
+    <w:p>
       <w:pPr>
         <w:pStyle w:val="Heading1"/>
       </w:pPr>

</xml_diff>